<commit_message>
fix: resolve all 3 assessment issues - add @x402-avm dependencies & vendored lib, refine pitch deck line 70, remove stale PDF
</commit_message>
<xml_diff>
--- a/docs/PROJECT_EXPLAINER_HINGLISH.docx
+++ b/docs/PROJECT_EXPLAINER_HINGLISH.docx
@@ -486,16 +486,16 @@
         <w:spacing w:before="40" w:after="40"/>
       </w:pPr>
       <w:r>
-        <w:t xml:space="preserve">Har generated signal ka ek unique 256-bit </w:t>
+        <w:t xml:space="preserve">Yeh cryptographic receipt hash Algorand Testnet ke </w:t>
       </w:r>
       <w:r>
         <w:rPr>
           <w:b/>
         </w:rPr>
-        <w:t>SHA-256 cryptographic hash</w:t>
+        <w:t>Payment Transaction Receipt</w:t>
       </w:r>
       <w:r>
-        <w:t xml:space="preserve"> banta hai (</w:t>
+        <w:t xml:space="preserve"> me indelibly anchor ho jata hai (</w:t>
       </w:r>
       <w:r>
         <w:rPr>
@@ -506,34 +506,7 @@
         <w:t>sha256(token:score:verdict:txId:timestamp)</w:t>
       </w:r>
       <w:r>
-        <w:t>).</w:t>
-      </w:r>
-    </w:p>
-    <w:p>
-      <w:pPr>
-        <w:pStyle w:val="ListBullet"/>
-        <w:spacing w:before="40" w:after="40"/>
-      </w:pPr>
-      <w:r>
-        <w:t xml:space="preserve">Humne </w:t>
-      </w:r>
-      <w:r>
-        <w:rPr>
-          <w:b/>
-        </w:rPr>
-        <w:t>PyTeal ARC-4 Smart Contract (`contracts/approval.teal`)</w:t>
-      </w:r>
-      <w:r>
-        <w:t xml:space="preserve"> banaya hai jo is hash ko Algorand Testnet ke </w:t>
-      </w:r>
-      <w:r>
-        <w:rPr>
-          <w:b/>
-        </w:rPr>
-        <w:t>Box Storage</w:t>
-      </w:r>
-      <w:r>
-        <w:t xml:space="preserve"> me permanently write kar deta hai. Pura audit trail on-chain rehta hai!</w:t>
+        <w:t>). Pura audit trail on-chain rehta hai!</w:t>
       </w:r>
     </w:p>
     <w:p>

</xml_diff>

<commit_message>
feat: complete UI/UX overhaul, endpoint.config.ts extraction, 2nd x402 endpoint, dynamic payouts, and explainer doc cleanup
</commit_message>
<xml_diff>
--- a/docs/PROJECT_EXPLAINER_HINGLISH.docx
+++ b/docs/PROJECT_EXPLAINER_HINGLISH.docx
@@ -477,7 +477,7 @@
           <w:color w:val="334155"/>
           <w:sz w:val="26"/>
         </w:rPr>
-        <w:t>3. ⛓️ Algorand Box Storage Signal Attestation</w:t>
+        <w:t>3. ⛓️ Cryptographic Signal Attestation Digest</w:t>
       </w:r>
     </w:p>
     <w:p>
@@ -486,7 +486,7 @@
         <w:spacing w:before="40" w:after="40"/>
       </w:pPr>
       <w:r>
-        <w:t xml:space="preserve">Yeh cryptographic receipt hash Algorand Testnet ke </w:t>
+        <w:t xml:space="preserve">Yeh cryptographic attestation hash Algorand Testnet ke </w:t>
       </w:r>
       <w:r>
         <w:rPr>
@@ -495,7 +495,7 @@
         <w:t>Payment Transaction Receipt</w:t>
       </w:r>
       <w:r>
-        <w:t xml:space="preserve"> me indelibly anchor ho jata hai (</w:t>
+        <w:t xml:space="preserve"> me anchor ho jata hai (</w:t>
       </w:r>
       <w:r>
         <w:rPr>
@@ -506,7 +506,18 @@
         <w:t>sha256(token:score:verdict:txId:timestamp)</w:t>
       </w:r>
       <w:r>
-        <w:t>). Pura audit trail on-chain rehta hai!</w:t>
+        <w:t>). Pura audit trail transaction ID ke saath verifiable hai! PyTeal Box Storage contract (</w:t>
+      </w:r>
+      <w:r>
+        <w:rPr>
+          <w:rFonts w:ascii="Consolas" w:hAnsi="Consolas"/>
+          <w:color w:val="0284C7"/>
+          <w:sz w:val="19"/>
+        </w:rPr>
+        <w:t>contracts/signal_attestation.py</w:t>
+      </w:r>
+      <w:r>
+        <w:t>) mainnet implementation ke liye prepared hai.</w:t>
       </w:r>
     </w:p>
     <w:p>
@@ -705,7 +716,7 @@
         <w:br/>
         <w:t xml:space="preserve">       ▼</w:t>
         <w:br/>
-        <w:t>10. Orchestrator On-Chain Receipt, SHA-256 Box Storage Hash, Aur Fused Score UI Par Display Kar Deta Hai! 🎉</w:t>
+        <w:t>10. Orchestrator On-Chain Receipt, SHA-256 Attestation Hash, Aur Fused Score UI Par Display Kar Deta Hai! 🎉</w:t>
       </w:r>
     </w:p>
     <w:p>
@@ -1099,7 +1110,7 @@
         <w:rPr>
           <w:i/>
         </w:rPr>
-        <w:t>"Hono.js on AWS EC2, FinBERT Financial Sentiment NLP, CoinGecko Live Market Data, PyTeal ARC-4 Box Storage Smart Contracts, and Lute Wallet."</w:t>
+        <w:t>"Hono.js on AWS EC2, FinBERT Financial Sentiment NLP, CoinGecko Live Market Data, GoPlausible Facilitator Verification, SHA-256 Cryptographic Attestation Engine, and Lute Wallet."</w:t>
       </w:r>
       <w:r/>
     </w:p>

</xml_diff>